<commit_message>
docs: prominently add github repository link to all manuals
</commit_message>
<xml_diff>
--- a/TOC_HOANG_HANDOVER.docx
+++ b/TOC_HOANG_HANDOVER.docx
@@ -2,7 +2,7 @@
 <file path=word/document.xml><?xml version="1.0" encoding="utf-8"?>
 <w:document xmlns:w="http://schemas.openxmlformats.org/wordprocessingml/2006/main" xmlns:m="http://schemas.openxmlformats.org/officeDocument/2006/math" xmlns:r="http://schemas.openxmlformats.org/officeDocument/2006/relationships" xmlns:o="urn:schemas-microsoft-com:office:office" xmlns:v="urn:schemas-microsoft-com:vml" xmlns:w10="urn:schemas-microsoft-com:office:word" xmlns:a="http://schemas.openxmlformats.org/drawingml/2006/main" xmlns:pic="http://schemas.openxmlformats.org/drawingml/2006/picture" xmlns:wp="http://schemas.openxmlformats.org/drawingml/2006/wordprocessingDrawing">
   <w:body>
-    <w:bookmarkStart w:id="24" w:name="X466c2f23e36cc73ef3c3b322b79a69cc9cd34d7"/>
+    <w:bookmarkStart w:id="25" w:name="X466c2f23e36cc73ef3c3b322b79a69cc9cd34d7"/>
     <w:p>
       <w:pPr>
         <w:pStyle w:val="Heading1"/>
@@ -15,6 +15,27 @@
       <w:pPr>
         <w:pStyle w:val="FirstParagraph"/>
       </w:pPr>
+      <w:r>
+        <w:rPr>
+          <w:b/>
+          <w:bCs/>
+        </w:rPr>
+        <w:t xml:space="preserve">GitHub Repository:</w:t>
+      </w:r>
+      <w:r>
+        <w:t xml:space="preserve"> </w:t>
+      </w:r>
+      <w:hyperlink r:id="rId9">
+        <w:r>
+          <w:rPr>
+            <w:rStyle w:val="Hyperlink"/>
+          </w:rPr>
+          <w:t xml:space="preserve">https://github.com/vuhoang2708/toc-hoang-dong-yen-duy-xuyen</w:t>
+        </w:r>
+      </w:hyperlink>
+      <w:r>
+        <w:t xml:space="preserve"> </w:t>
+      </w:r>
       <w:r>
         <w:rPr>
           <w:b/>
@@ -54,7 +75,7 @@
         </w:pict>
       </w:r>
     </w:p>
-    <w:bookmarkStart w:id="19" w:name="các-liên-kết-chính-thức-official-links"/>
+    <w:bookmarkStart w:id="20" w:name="các-liên-kết-chính-thức-official-links"/>
     <w:p>
       <w:pPr>
         <w:pStyle w:val="Heading2"/>
@@ -63,7 +84,7 @@
         <w:t xml:space="preserve">1. CÁC LIÊN KẾT CHÍNH THỨC (OFFICIAL LINKS)</w:t>
       </w:r>
     </w:p>
-    <w:bookmarkStart w:id="13" w:name="kênh-cộng-đồng-thông-tin"/>
+    <w:bookmarkStart w:id="14" w:name="kênh-cộng-đồng-thông-tin"/>
     <w:p>
       <w:pPr>
         <w:pStyle w:val="Heading3"/>
@@ -90,7 +111,7 @@
       <w:r>
         <w:t xml:space="preserve"> </w:t>
       </w:r>
-      <w:hyperlink r:id="rId9">
+      <w:hyperlink r:id="rId10">
         <w:r>
           <w:rPr>
             <w:rStyle w:val="Hyperlink"/>
@@ -117,7 +138,7 @@
       <w:r>
         <w:t xml:space="preserve"> </w:t>
       </w:r>
-      <w:hyperlink r:id="rId10">
+      <w:hyperlink r:id="rId11">
         <w:r>
           <w:rPr>
             <w:rStyle w:val="Hyperlink"/>
@@ -144,7 +165,7 @@
       <w:r>
         <w:t xml:space="preserve"> </w:t>
       </w:r>
-      <w:hyperlink r:id="rId11">
+      <w:hyperlink r:id="rId12">
         <w:r>
           <w:rPr>
             <w:rStyle w:val="Hyperlink"/>
@@ -171,7 +192,7 @@
       <w:r>
         <w:t xml:space="preserve"> </w:t>
       </w:r>
-      <w:hyperlink r:id="rId12">
+      <w:hyperlink r:id="rId13">
         <w:r>
           <w:rPr>
             <w:rStyle w:val="Hyperlink"/>
@@ -180,8 +201,8 @@
         </w:r>
       </w:hyperlink>
     </w:p>
-    <w:bookmarkEnd w:id="13"/>
-    <w:bookmarkStart w:id="18" w:name="công-cụ-cập-nhật-thông-tin"/>
+    <w:bookmarkEnd w:id="14"/>
+    <w:bookmarkStart w:id="19" w:name="công-cụ-cập-nhật-thông-tin"/>
     <w:p>
       <w:pPr>
         <w:pStyle w:val="Heading3"/>
@@ -208,7 +229,7 @@
       <w:r>
         <w:t xml:space="preserve"> </w:t>
       </w:r>
-      <w:hyperlink r:id="rId14">
+      <w:hyperlink r:id="rId15">
         <w:r>
           <w:rPr>
             <w:rStyle w:val="Hyperlink"/>
@@ -235,7 +256,7 @@
       <w:r>
         <w:t xml:space="preserve"> </w:t>
       </w:r>
-      <w:hyperlink r:id="rId15">
+      <w:hyperlink r:id="rId16">
         <w:r>
           <w:rPr>
             <w:rStyle w:val="Hyperlink"/>
@@ -262,7 +283,7 @@
       <w:r>
         <w:t xml:space="preserve"> </w:t>
       </w:r>
-      <w:hyperlink r:id="rId16">
+      <w:hyperlink r:id="rId17">
         <w:r>
           <w:rPr>
             <w:rStyle w:val="Hyperlink"/>
@@ -295,7 +316,7 @@
       <w:r>
         <w:t xml:space="preserve"> </w:t>
       </w:r>
-      <w:hyperlink r:id="rId17">
+      <w:hyperlink r:id="rId18">
         <w:r>
           <w:rPr>
             <w:rStyle w:val="Hyperlink"/>
@@ -327,9 +348,9 @@
         </w:pict>
       </w:r>
     </w:p>
-    <w:bookmarkEnd w:id="18"/>
     <w:bookmarkEnd w:id="19"/>
-    <w:bookmarkStart w:id="22" w:name="hướng-dẫn-quản-lý-dữ-liệu"/>
+    <w:bookmarkEnd w:id="20"/>
+    <w:bookmarkStart w:id="23" w:name="hướng-dẫn-quản-lý-dữ-liệu"/>
     <w:p>
       <w:pPr>
         <w:pStyle w:val="Heading2"/>
@@ -338,7 +359,7 @@
         <w:t xml:space="preserve">2. HƯỚNG DẪN QUẢN LÝ DỮ LIỆU</w:t>
       </w:r>
     </w:p>
-    <w:bookmarkStart w:id="20" w:name="tiếp-nhận-thông-tin-biên-tập-gia-phả"/>
+    <w:bookmarkStart w:id="21" w:name="tiếp-nhận-thông-tin-biên-tập-gia-phả"/>
     <w:p>
       <w:pPr>
         <w:pStyle w:val="Heading3"/>
@@ -481,8 +502,8 @@
         <w:t xml:space="preserve">Ban biên tập cần đối chiếu thông tin người gửi với dữ liệu gốc trước khi cập nhật vào Cây phả hệ chính thức.</w:t>
       </w:r>
     </w:p>
-    <w:bookmarkEnd w:id="20"/>
-    <w:bookmarkStart w:id="21" w:name="cơ-chế-tự-động-hóa-sự-kiện"/>
+    <w:bookmarkEnd w:id="21"/>
+    <w:bookmarkStart w:id="22" w:name="cơ-chế-tự-động-hóa-sự-kiện"/>
     <w:p>
       <w:pPr>
         <w:pStyle w:val="Heading3"/>
@@ -558,9 +579,9 @@
         </w:pict>
       </w:r>
     </w:p>
-    <w:bookmarkEnd w:id="21"/>
     <w:bookmarkEnd w:id="22"/>
-    <w:bookmarkStart w:id="23" w:name="lưu-ý-khi-biên-tập"/>
+    <w:bookmarkEnd w:id="23"/>
+    <w:bookmarkStart w:id="24" w:name="lưu-ý-khi-biên-tập"/>
     <w:p>
       <w:pPr>
         <w:pStyle w:val="Heading2"/>
@@ -615,8 +636,8 @@
         <w:t xml:space="preserve">(Cập nhật: 22/04/2026)</w:t>
       </w:r>
     </w:p>
-    <w:bookmarkEnd w:id="23"/>
     <w:bookmarkEnd w:id="24"/>
+    <w:bookmarkEnd w:id="25"/>
     <w:sectPr>
       <w:footnotePr>
         <w:numRestart w:val="eachSect"/>

</xml_diff>